<commit_message>
made slight changes to report 1
</commit_message>
<xml_diff>
--- a/Project report 1 - phase 1 .docx
+++ b/Project report 1 - phase 1 .docx
@@ -1,387 +1,204 @@
 
 <file path=word/document.xml><?xml version="1.0" encoding="utf-8"?>
-<w:document xmlns:mc="http://schemas.openxmlformats.org/markup-compatibility/2006" xmlns:o="urn:schemas-microsoft-com:office:office" xmlns:r="http://schemas.openxmlformats.org/officeDocument/2006/relationships" xmlns:m="http://schemas.openxmlformats.org/officeDocument/2006/math" xmlns:v="urn:schemas-microsoft-com:vml" xmlns:wp="http://schemas.openxmlformats.org/drawingml/2006/wordprocessingDrawing" xmlns:w10="urn:schemas-microsoft-com:office:word" xmlns:w="http://schemas.openxmlformats.org/wordprocessingml/2006/main" xmlns:wne="http://schemas.microsoft.com/office/word/2006/wordml" xmlns:sl="http://schemas.openxmlformats.org/schemaLibrary/2006/main" xmlns:a="http://schemas.openxmlformats.org/drawingml/2006/main" xmlns:pic="http://schemas.openxmlformats.org/drawingml/2006/picture" xmlns:c="http://schemas.openxmlformats.org/drawingml/2006/chart" xmlns:lc="http://schemas.openxmlformats.org/drawingml/2006/lockedCanvas" xmlns:dgm="http://schemas.openxmlformats.org/drawingml/2006/diagram" xmlns:wps="http://schemas.microsoft.com/office/word/2010/wordprocessingShape" xmlns:wpg="http://schemas.microsoft.com/office/word/2010/wordprocessingGroup" xmlns:w14="http://schemas.microsoft.com/office/word/2010/wordml" xmlns:w15="http://schemas.microsoft.com/office/word/2012/wordml" xmlns:w16="http://schemas.microsoft.com/office/word/2018/wordml" xmlns:w16cex="http://schemas.microsoft.com/office/word/2018/wordml/cex" xmlns:w16cid="http://schemas.microsoft.com/office/word/2016/wordml/cid" xmlns="http://schemas.microsoft.com/office/tasks/2019/documenttasks" xmlns:cr="http://schemas.microsoft.com/office/comments/2020/reactions">
+<w:document xmlns:wpc="http://schemas.microsoft.com/office/word/2010/wordprocessingCanvas" xmlns:cx="http://schemas.microsoft.com/office/drawing/2014/chartex" xmlns:cx1="http://schemas.microsoft.com/office/drawing/2015/9/8/chartex" xmlns:cx2="http://schemas.microsoft.com/office/drawing/2015/10/21/chartex" xmlns:cx3="http://schemas.microsoft.com/office/drawing/2016/5/9/chartex" xmlns:cx4="http://schemas.microsoft.com/office/drawing/2016/5/10/chartex" xmlns:cx5="http://schemas.microsoft.com/office/drawing/2016/5/11/chartex" xmlns:cx6="http://schemas.microsoft.com/office/drawing/2016/5/12/chartex" xmlns:cx7="http://schemas.microsoft.com/office/drawing/2016/5/13/chartex" xmlns:cx8="http://schemas.microsoft.com/office/drawing/2016/5/14/chartex" xmlns:mc="http://schemas.openxmlformats.org/markup-compatibility/2006" xmlns:aink="http://schemas.microsoft.com/office/drawing/2016/ink" xmlns:am3d="http://schemas.microsoft.com/office/drawing/2017/model3d" xmlns:o="urn:schemas-microsoft-com:office:office" xmlns:oel="http://schemas.microsoft.com/office/2019/extlst" xmlns:r="http://schemas.openxmlformats.org/officeDocument/2006/relationships" xmlns:m="http://schemas.openxmlformats.org/officeDocument/2006/math" xmlns:v="urn:schemas-microsoft-com:vml" xmlns:wp14="http://schemas.microsoft.com/office/word/2010/wordprocessingDrawing" xmlns:wp="http://schemas.openxmlformats.org/drawingml/2006/wordprocessingDrawing" xmlns:w10="urn:schemas-microsoft-com:office:word" xmlns:w="http://schemas.openxmlformats.org/wordprocessingml/2006/main" xmlns:w14="http://schemas.microsoft.com/office/word/2010/wordml" xmlns:w15="http://schemas.microsoft.com/office/word/2012/wordml" xmlns:w16cex="http://schemas.microsoft.com/office/word/2018/wordml/cex" xmlns:w16cid="http://schemas.microsoft.com/office/word/2016/wordml/cid" xmlns:w16="http://schemas.microsoft.com/office/word/2018/wordml" xmlns:w16du="http://schemas.microsoft.com/office/word/2023/wordml/word16du" xmlns:w16sdtdh="http://schemas.microsoft.com/office/word/2020/wordml/sdtdatahash" xmlns:w16sdtfl="http://schemas.microsoft.com/office/word/2024/wordml/sdtformatlock" xmlns:w16se="http://schemas.microsoft.com/office/word/2015/wordml/symex" xmlns:wpg="http://schemas.microsoft.com/office/word/2010/wordprocessingGroup" xmlns:wpi="http://schemas.microsoft.com/office/word/2010/wordprocessingInk" xmlns:wne="http://schemas.microsoft.com/office/word/2006/wordml" xmlns:wps="http://schemas.microsoft.com/office/word/2010/wordprocessingShape" mc:Ignorable="w14 w15 w16se w16cid w16 w16cex w16sdtdh w16sdtfl w16du wp14">
   <w:body>
     <w:p>
       <w:pPr>
         <w:pStyle w:val="Title"/>
         <w:jc w:val="center"/>
-        <w:rPr/>
-      </w:pPr>
-      <w:bookmarkStart w:colFirst="0" w:colLast="0" w:name="_262h7qx8jdpm" w:id="0"/>
+      </w:pPr>
+      <w:bookmarkStart w:id="0" w:name="_262h7qx8jdpm" w:colFirst="0" w:colLast="0"/>
       <w:bookmarkEnd w:id="0"/>
-      <w:r>
-        <w:rPr>
-          <w:rtl w:val="0"/>
-        </w:rPr>
-      </w:r>
     </w:p>
     <w:p>
       <w:pPr>
         <w:pStyle w:val="Title"/>
         <w:jc w:val="center"/>
-        <w:rPr/>
-      </w:pPr>
-      <w:bookmarkStart w:colFirst="0" w:colLast="0" w:name="_rg363ccyt9q" w:id="1"/>
+      </w:pPr>
+      <w:bookmarkStart w:id="1" w:name="_rg363ccyt9q" w:colFirst="0" w:colLast="0"/>
       <w:bookmarkEnd w:id="1"/>
-      <w:r>
-        <w:rPr>
-          <w:rtl w:val="0"/>
-        </w:rPr>
-      </w:r>
     </w:p>
     <w:p>
       <w:pPr>
         <w:pStyle w:val="Title"/>
         <w:jc w:val="center"/>
-        <w:rPr/>
-      </w:pPr>
-      <w:bookmarkStart w:colFirst="0" w:colLast="0" w:name="_4ayu9t7rp2xb" w:id="2"/>
+      </w:pPr>
+      <w:bookmarkStart w:id="2" w:name="_4ayu9t7rp2xb" w:colFirst="0" w:colLast="0"/>
       <w:bookmarkEnd w:id="2"/>
-      <w:r>
-        <w:rPr>
-          <w:rtl w:val="0"/>
-        </w:rPr>
-      </w:r>
     </w:p>
     <w:p>
       <w:pPr>
         <w:pStyle w:val="Title"/>
-        <w:spacing w:line="276" w:lineRule="auto"/>
         <w:jc w:val="center"/>
-        <w:rPr/>
-      </w:pPr>
-      <w:bookmarkStart w:colFirst="0" w:colLast="0" w:name="_iee3jrlg06ex" w:id="3"/>
+      </w:pPr>
+      <w:bookmarkStart w:id="3" w:name="_iee3jrlg06ex" w:colFirst="0" w:colLast="0"/>
       <w:bookmarkEnd w:id="3"/>
-      <w:r>
-        <w:rPr>
-          <w:rtl w:val="0"/>
-        </w:rPr>
-      </w:r>
     </w:p>
     <w:p>
       <w:pPr>
         <w:pStyle w:val="Title"/>
-        <w:spacing w:line="276" w:lineRule="auto"/>
         <w:jc w:val="center"/>
-        <w:rPr/>
-      </w:pPr>
-      <w:bookmarkStart w:colFirst="0" w:colLast="0" w:name="_veybybndwkt" w:id="4"/>
+      </w:pPr>
+      <w:bookmarkStart w:id="4" w:name="_veybybndwkt" w:colFirst="0" w:colLast="0"/>
       <w:bookmarkEnd w:id="4"/>
       <w:r>
-        <w:rPr>
-          <w:rtl w:val="0"/>
-        </w:rPr>
-        <w:t xml:space="preserve">ISTE 240 PROJECT</w:t>
+        <w:t>ISTE 240 PROJECT</w:t>
       </w:r>
     </w:p>
     <w:p>
       <w:pPr>
         <w:pStyle w:val="Heading1"/>
         <w:jc w:val="center"/>
-        <w:rPr/>
-      </w:pPr>
-      <w:bookmarkStart w:colFirst="0" w:colLast="0" w:name="_mz0wj6of9h90" w:id="5"/>
+      </w:pPr>
+      <w:bookmarkStart w:id="5" w:name="_mz0wj6of9h90" w:colFirst="0" w:colLast="0"/>
       <w:bookmarkEnd w:id="5"/>
       <w:r>
-        <w:rPr>
-          <w:rtl w:val="0"/>
-        </w:rPr>
-        <w:t xml:space="preserve">Movie Review Application</w:t>
+        <w:t>Movie Review Application</w:t>
       </w:r>
     </w:p>
     <w:p>
       <w:pPr>
         <w:pStyle w:val="Heading1"/>
-        <w:spacing w:line="276" w:lineRule="auto"/>
         <w:jc w:val="center"/>
         <w:rPr>
-          <w:b w:val="1"/>
-          <w:bCs w:val="1"/>
+          <w:b/>
+          <w:bCs/>
         </w:rPr>
       </w:pPr>
-      <w:bookmarkStart w:colFirst="0" w:colLast="0" w:name="_zdr2jjxowqb5" w:id="6"/>
+      <w:bookmarkStart w:id="6" w:name="_zdr2jjxowqb5" w:colFirst="0" w:colLast="0"/>
       <w:bookmarkEnd w:id="6"/>
       <w:r>
         <w:rPr>
-          <w:b w:val="1"/>
-          <w:bCs w:val="1"/>
-          <w:rtl w:val="0"/>
+          <w:b/>
+          <w:bCs/>
         </w:rPr>
-        <w:t xml:space="preserve">TEAM 5</w:t>
+        <w:t>TEAM 5</w:t>
       </w:r>
     </w:p>
     <w:p>
       <w:pPr>
         <w:pStyle w:val="Heading2"/>
         <w:jc w:val="center"/>
-        <w:rPr/>
-      </w:pPr>
-      <w:bookmarkStart w:colFirst="0" w:colLast="0" w:name="_rrdcx2cj36n8" w:id="7"/>
+      </w:pPr>
+      <w:bookmarkStart w:id="7" w:name="_rrdcx2cj36n8" w:colFirst="0" w:colLast="0"/>
       <w:bookmarkEnd w:id="7"/>
       <w:r>
-        <w:rPr>
-          <w:rtl w:val="0"/>
-        </w:rPr>
-        <w:t xml:space="preserve">Amal Junaid (751008715)</w:t>
+        <w:t>Amal Junaid (751008715)</w:t>
       </w:r>
     </w:p>
     <w:p>
       <w:pPr>
         <w:pStyle w:val="Heading2"/>
         <w:jc w:val="center"/>
-        <w:rPr/>
-      </w:pPr>
-      <w:bookmarkStart w:colFirst="0" w:colLast="0" w:name="_nilq9te4qbvb" w:id="8"/>
+      </w:pPr>
+      <w:bookmarkStart w:id="8" w:name="_nilq9te4qbvb" w:colFirst="0" w:colLast="0"/>
       <w:bookmarkEnd w:id="8"/>
       <w:r>
-        <w:rPr>
-          <w:rtl w:val="0"/>
-        </w:rPr>
-        <w:t xml:space="preserve">Madheeha</w:t>
+        <w:t>Madheeha</w:t>
+      </w:r>
+      <w:r>
+        <w:t>(764002947)</w:t>
       </w:r>
     </w:p>
     <w:p>
       <w:pPr>
         <w:pStyle w:val="Heading2"/>
         <w:jc w:val="center"/>
-        <w:rPr/>
-      </w:pPr>
-      <w:bookmarkStart w:colFirst="0" w:colLast="0" w:name="_sfwnujbfa468" w:id="9"/>
+      </w:pPr>
+      <w:bookmarkStart w:id="9" w:name="_sfwnujbfa468" w:colFirst="0" w:colLast="0"/>
       <w:bookmarkEnd w:id="9"/>
       <w:r>
-        <w:rPr>
-          <w:rtl w:val="0"/>
-        </w:rPr>
-        <w:t xml:space="preserve">Mehrin</w:t>
+        <w:t>Mehrin</w:t>
+      </w:r>
+      <w:r>
+        <w:t>(</w:t>
+      </w:r>
+      <w:r>
+        <w:t>418006818</w:t>
+      </w:r>
+      <w:r>
+        <w:t>)</w:t>
       </w:r>
     </w:p>
     <w:p>
       <w:pPr>
         <w:pStyle w:val="Heading2"/>
         <w:jc w:val="center"/>
-        <w:rPr/>
-      </w:pPr>
-      <w:bookmarkStart w:colFirst="0" w:colLast="0" w:name="_fwp3yx3y0qzt" w:id="10"/>
+      </w:pPr>
+      <w:bookmarkStart w:id="10" w:name="_fwp3yx3y0qzt" w:colFirst="0" w:colLast="0"/>
       <w:bookmarkEnd w:id="10"/>
       <w:r>
-        <w:rPr>
-          <w:rtl w:val="0"/>
-        </w:rPr>
-        <w:t xml:space="preserve">Grishma</w:t>
-      </w:r>
-    </w:p>
-    <w:p>
-      <w:pPr>
-        <w:rPr/>
-      </w:pPr>
-      <w:r>
-        <w:rPr>
-          <w:rtl w:val="0"/>
-        </w:rPr>
-      </w:r>
-    </w:p>
-    <w:p>
-      <w:pPr>
-        <w:rPr/>
-      </w:pPr>
-      <w:r>
-        <w:rPr>
-          <w:rtl w:val="0"/>
-        </w:rPr>
-      </w:r>
-    </w:p>
-    <w:p>
-      <w:pPr>
-        <w:rPr/>
-      </w:pPr>
-      <w:r>
-        <w:rPr>
-          <w:rtl w:val="0"/>
-        </w:rPr>
-      </w:r>
-    </w:p>
-    <w:p>
-      <w:pPr>
-        <w:rPr/>
-      </w:pPr>
-      <w:r>
-        <w:rPr>
-          <w:rtl w:val="0"/>
-        </w:rPr>
-      </w:r>
-    </w:p>
-    <w:p>
-      <w:pPr>
-        <w:rPr/>
-      </w:pPr>
-      <w:r>
-        <w:rPr>
-          <w:rtl w:val="0"/>
-        </w:rPr>
-      </w:r>
-    </w:p>
-    <w:p>
-      <w:pPr>
-        <w:rPr/>
-      </w:pPr>
-      <w:r>
-        <w:rPr>
-          <w:rtl w:val="0"/>
-        </w:rPr>
-      </w:r>
-    </w:p>
-    <w:p>
-      <w:pPr>
-        <w:rPr/>
-      </w:pPr>
-      <w:r>
-        <w:rPr>
-          <w:rtl w:val="0"/>
-        </w:rPr>
-      </w:r>
-    </w:p>
-    <w:p>
-      <w:pPr>
-        <w:rPr/>
-      </w:pPr>
-      <w:r>
-        <w:rPr>
-          <w:rtl w:val="0"/>
-        </w:rPr>
-      </w:r>
-    </w:p>
-    <w:p>
-      <w:pPr>
-        <w:rPr/>
-      </w:pPr>
-      <w:r>
-        <w:rPr>
-          <w:rtl w:val="0"/>
-        </w:rPr>
-      </w:r>
-    </w:p>
-    <w:p>
-      <w:pPr>
-        <w:rPr/>
-      </w:pPr>
-      <w:r>
-        <w:rPr>
-          <w:rtl w:val="0"/>
-        </w:rPr>
-      </w:r>
-    </w:p>
-    <w:p>
-      <w:pPr>
-        <w:rPr/>
-      </w:pPr>
-      <w:r>
-        <w:rPr>
-          <w:rtl w:val="0"/>
-        </w:rPr>
-      </w:r>
-    </w:p>
-    <w:p>
-      <w:pPr>
-        <w:rPr/>
-      </w:pPr>
-      <w:r>
-        <w:rPr>
-          <w:rtl w:val="0"/>
-        </w:rPr>
-      </w:r>
-    </w:p>
+        <w:t>Grishma</w:t>
+      </w:r>
+      <w:r>
+        <w:t>(</w:t>
+      </w:r>
+      <w:r>
+        <w:t>761001853</w:t>
+      </w:r>
+      <w:r>
+        <w:t>)</w:t>
+      </w:r>
+    </w:p>
+    <w:p/>
+    <w:p/>
+    <w:p/>
+    <w:p/>
+    <w:p/>
+    <w:p/>
+    <w:p/>
+    <w:p/>
+    <w:p/>
+    <w:p/>
+    <w:p/>
+    <w:p/>
     <w:p>
       <w:pPr>
         <w:pStyle w:val="Heading3"/>
-        <w:rPr/>
-      </w:pPr>
-      <w:bookmarkStart w:colFirst="0" w:colLast="0" w:name="_z98bk8nvarty" w:id="11"/>
+      </w:pPr>
+      <w:bookmarkStart w:id="11" w:name="_z98bk8nvarty" w:colFirst="0" w:colLast="0"/>
       <w:bookmarkEnd w:id="11"/>
       <w:r>
-        <w:rPr>
-          <w:rtl w:val="0"/>
-        </w:rPr>
-        <w:t xml:space="preserve">Executive Summary</w:t>
-      </w:r>
-    </w:p>
-    <w:p>
-      <w:pPr>
-        <w:rPr/>
-      </w:pPr>
-      <w:r>
-        <w:rPr>
-          <w:rtl w:val="0"/>
-        </w:rPr>
+        <w:lastRenderedPageBreak/>
+        <w:t>Executive Summary</w:t>
+      </w:r>
+    </w:p>
+    <w:p>
+      <w:r>
         <w:t xml:space="preserve">The goal of this project will focus on creating a movie review application which includes a database of English movies released in theatres last year and their general ratings. It would allow for users to post reviews of movies they have seen and give in their own ratings, either anonymously or through creating a profile. </w:t>
       </w:r>
     </w:p>
     <w:p>
       <w:pPr>
         <w:pStyle w:val="Heading3"/>
-        <w:spacing w:after="0" w:before="0" w:lineRule="auto"/>
+        <w:spacing w:before="0" w:after="0"/>
         <w:ind w:left="1800" w:hanging="360"/>
-        <w:rPr/>
-      </w:pPr>
-      <w:bookmarkStart w:colFirst="0" w:colLast="0" w:name="_o7huihlpeqm3" w:id="12"/>
+      </w:pPr>
+      <w:bookmarkStart w:id="12" w:name="_o7huihlpeqm3" w:colFirst="0" w:colLast="0"/>
       <w:bookmarkEnd w:id="12"/>
-      <w:r>
-        <w:rPr>
-          <w:rtl w:val="0"/>
-        </w:rPr>
-      </w:r>
     </w:p>
     <w:p>
       <w:pPr>
         <w:pStyle w:val="Heading3"/>
-        <w:spacing w:after="0" w:before="0" w:lineRule="auto"/>
-        <w:ind w:left="0" w:firstLine="0"/>
-        <w:rPr/>
-      </w:pPr>
-      <w:bookmarkStart w:colFirst="0" w:colLast="0" w:name="_mjku6zymqq1d" w:id="13"/>
-      <w:bookmarkEnd w:id="13"/>
-      <w:r>
-        <w:rPr>
-          <w:rtl w:val="0"/>
-        </w:rPr>
-        <w:t xml:space="preserve">Project scope and timeline</w:t>
-      </w:r>
-    </w:p>
-    <w:p>
-      <w:pPr>
-        <w:rPr/>
-      </w:pPr>
-      <w:r>
-        <w:rPr>
-          <w:rtl w:val="0"/>
-        </w:rPr>
-        <w:t xml:space="preserve">For the scope of this project, we will focus on English movies released internationally in theatres in 2025.</w:t>
-      </w:r>
-    </w:p>
-    <w:p>
-      <w:pPr>
-        <w:rPr/>
-      </w:pPr>
-      <w:r>
-        <w:rPr>
-          <w:rtl w:val="0"/>
-        </w:rPr>
-      </w:r>
-    </w:p>
+        <w:spacing w:before="0" w:after="0"/>
+      </w:pPr>
+      <w:r>
+        <w:t>Project scope and timeline</w:t>
+      </w:r>
+    </w:p>
+    <w:p>
+      <w:r>
+        <w:t>For the scope of this project, we will focus on English movies released internationally in theatres in 2025.</w:t>
+      </w:r>
+    </w:p>
+    <w:p/>
     <w:p>
       <w:pPr>
         <w:pStyle w:val="Heading3"/>
-        <w:spacing w:after="0" w:before="0" w:lineRule="auto"/>
-        <w:ind w:left="0" w:firstLine="0"/>
-        <w:rPr/>
-      </w:pPr>
-      <w:bookmarkStart w:colFirst="0" w:colLast="0" w:name="_mjku6zymqq1d" w:id="13"/>
-      <w:bookmarkEnd w:id="13"/>
-      <w:r>
-        <w:rPr>
-          <w:rtl w:val="0"/>
-        </w:rPr>
-        <w:t xml:space="preserve">Key features</w:t>
+        <w:spacing w:before="0" w:after="0"/>
+      </w:pPr>
+      <w:r>
+        <w:t>Key features</w:t>
       </w:r>
     </w:p>
     <w:p>
@@ -390,16 +207,9 @@
           <w:ilvl w:val="0"/>
           <w:numId w:val="3"/>
         </w:numPr>
-        <w:ind w:left="720" w:hanging="360"/>
-        <w:rPr>
-          <w:u w:val="none"/>
-        </w:rPr>
-      </w:pPr>
-      <w:r>
-        <w:rPr>
-          <w:rtl w:val="0"/>
-        </w:rPr>
-        <w:t xml:space="preserve">Listing of movies and ability to sort by genre, year of release or popularity</w:t>
+      </w:pPr>
+      <w:r>
+        <w:t>Listing of movies and ability to sort by genre, year of release or popularity</w:t>
       </w:r>
     </w:p>
     <w:p>
@@ -408,16 +218,9 @@
           <w:ilvl w:val="0"/>
           <w:numId w:val="3"/>
         </w:numPr>
-        <w:ind w:left="720" w:hanging="360"/>
-        <w:rPr>
-          <w:u w:val="none"/>
-        </w:rPr>
-      </w:pPr>
-      <w:r>
-        <w:rPr>
-          <w:rtl w:val="0"/>
-        </w:rPr>
-        <w:t xml:space="preserve">Displaying the movie poster alongside general rating</w:t>
+      </w:pPr>
+      <w:r>
+        <w:t>Displaying the movie poster alongside general rating</w:t>
       </w:r>
     </w:p>
     <w:p>
@@ -426,16 +229,9 @@
           <w:ilvl w:val="0"/>
           <w:numId w:val="3"/>
         </w:numPr>
-        <w:ind w:left="720" w:hanging="360"/>
-        <w:rPr>
-          <w:u w:val="none"/>
-        </w:rPr>
-      </w:pPr>
-      <w:r>
-        <w:rPr>
-          <w:rtl w:val="0"/>
-        </w:rPr>
-        <w:t xml:space="preserve">Ability for user to rate a movie they have seen or give a review</w:t>
+      </w:pPr>
+      <w:r>
+        <w:t>Ability for user to rate a movie they have seen or give a review</w:t>
       </w:r>
     </w:p>
     <w:p>
@@ -444,16 +240,9 @@
           <w:ilvl w:val="0"/>
           <w:numId w:val="3"/>
         </w:numPr>
-        <w:ind w:left="720" w:hanging="360"/>
-        <w:rPr>
-          <w:u w:val="none"/>
-        </w:rPr>
-      </w:pPr>
-      <w:r>
-        <w:rPr>
-          <w:rtl w:val="0"/>
-        </w:rPr>
-        <w:t xml:space="preserve">A recommendation system for the movie</w:t>
+      </w:pPr>
+      <w:r>
+        <w:t>A recommendation system for the movie</w:t>
       </w:r>
     </w:p>
     <w:p>
@@ -462,42 +251,19 @@
           <w:ilvl w:val="0"/>
           <w:numId w:val="3"/>
         </w:numPr>
-        <w:ind w:left="720" w:hanging="360"/>
-        <w:rPr>
-          <w:u w:val="none"/>
-        </w:rPr>
-      </w:pPr>
-      <w:r>
-        <w:rPr>
-          <w:rtl w:val="0"/>
-        </w:rPr>
-        <w:t xml:space="preserve">UI/UX design similar to that of imdb or letterboxd</w:t>
-      </w:r>
-    </w:p>
-    <w:p>
-      <w:pPr>
-        <w:rPr/>
-      </w:pPr>
-      <w:r>
-        <w:rPr>
-          <w:rtl w:val="0"/>
-        </w:rPr>
-      </w:r>
-    </w:p>
+      </w:pPr>
+      <w:r>
+        <w:t>UI/UX design similar to that of imdb or letterboxd</w:t>
+      </w:r>
+    </w:p>
+    <w:p/>
     <w:p>
       <w:pPr>
         <w:pStyle w:val="Heading3"/>
-        <w:spacing w:after="0" w:before="0" w:lineRule="auto"/>
-        <w:ind w:left="0" w:firstLine="0"/>
-        <w:rPr/>
-      </w:pPr>
-      <w:bookmarkStart w:colFirst="0" w:colLast="0" w:name="_mjku6zymqq1d" w:id="13"/>
-      <w:bookmarkEnd w:id="13"/>
-      <w:r>
-        <w:rPr>
-          <w:rtl w:val="0"/>
-        </w:rPr>
-        <w:t xml:space="preserve">User / interaction scenario(s)</w:t>
+        <w:spacing w:before="0" w:after="0"/>
+      </w:pPr>
+      <w:r>
+        <w:t>User / interaction scenario(s)</w:t>
       </w:r>
     </w:p>
     <w:p>
@@ -506,13 +272,9 @@
           <w:ilvl w:val="0"/>
           <w:numId w:val="3"/>
         </w:numPr>
-        <w:ind w:left="720" w:hanging="360"/>
-      </w:pPr>
-      <w:r>
-        <w:rPr>
-          <w:rtl w:val="0"/>
-        </w:rPr>
-        <w:t xml:space="preserve">Ability for user to rate a movie they have seen, as well as delete or change their rating</w:t>
+      </w:pPr>
+      <w:r>
+        <w:t>Ability for user to rate a movie they have seen, as well as delete or change their rating</w:t>
       </w:r>
     </w:p>
     <w:p>
@@ -521,16 +283,9 @@
           <w:ilvl w:val="0"/>
           <w:numId w:val="3"/>
         </w:numPr>
-        <w:ind w:left="720" w:hanging="360"/>
-        <w:rPr>
-          <w:u w:val="none"/>
-        </w:rPr>
-      </w:pPr>
-      <w:r>
-        <w:rPr>
-          <w:rtl w:val="0"/>
-        </w:rPr>
-        <w:t xml:space="preserve">Ability for user to post a review for a movie they have seen, as well as delete/update the review</w:t>
+      </w:pPr>
+      <w:r>
+        <w:t>Ability for user to post a review for a movie they have seen, as well as delete/update the review</w:t>
       </w:r>
     </w:p>
     <w:p>
@@ -539,13 +294,9 @@
           <w:ilvl w:val="0"/>
           <w:numId w:val="3"/>
         </w:numPr>
-        <w:ind w:left="720" w:hanging="360"/>
-      </w:pPr>
-      <w:r>
-        <w:rPr>
-          <w:rtl w:val="0"/>
-        </w:rPr>
-        <w:t xml:space="preserve">Ability for the user to create a profile</w:t>
+      </w:pPr>
+      <w:r>
+        <w:t>Ability for the user to create a profile</w:t>
       </w:r>
     </w:p>
     <w:p>
@@ -554,65 +305,37 @@
           <w:ilvl w:val="0"/>
           <w:numId w:val="3"/>
         </w:numPr>
-        <w:ind w:left="720" w:hanging="360"/>
-      </w:pPr>
-      <w:r>
+      </w:pPr>
+      <w:r>
+        <w:t>Interactive quiz that could give you a movie recommendation to watch</w:t>
+      </w:r>
+    </w:p>
+    <w:p/>
+    <w:p>
+      <w:pPr>
+        <w:pStyle w:val="Heading3"/>
+        <w:spacing w:before="0" w:after="0"/>
+      </w:pPr>
+      <w:bookmarkStart w:id="13" w:name="_mjku6zymqq1d" w:colFirst="0" w:colLast="0"/>
+      <w:bookmarkEnd w:id="13"/>
+      <w:r>
+        <w:t>Implementation details (e.g. technologies, tools, frameworks)</w:t>
+      </w:r>
+    </w:p>
+    <w:p/>
+    <w:p>
+      <w:pPr>
         <w:rPr>
-          <w:rtl w:val="0"/>
+          <w:b/>
+          <w:bCs/>
         </w:rPr>
-        <w:t xml:space="preserve">Interactive quiz that could give you a movie recommendation to watch</w:t>
-      </w:r>
-    </w:p>
-    <w:p>
-      <w:pPr>
-        <w:rPr/>
       </w:pPr>
       <w:r>
         <w:rPr>
-          <w:rtl w:val="0"/>
+          <w:b/>
+          <w:bCs/>
         </w:rPr>
-      </w:r>
-    </w:p>
-    <w:p>
-      <w:pPr>
-        <w:pStyle w:val="Heading3"/>
-        <w:spacing w:after="0" w:before="0" w:lineRule="auto"/>
-        <w:ind w:left="0" w:firstLine="0"/>
-        <w:rPr/>
-      </w:pPr>
-      <w:bookmarkStart w:colFirst="0" w:colLast="0" w:name="_mjku6zymqq1d" w:id="13"/>
-      <w:bookmarkEnd w:id="13"/>
-      <w:r>
-        <w:rPr>
-          <w:rtl w:val="0"/>
-        </w:rPr>
-        <w:t xml:space="preserve">Implementation details (e.g. technologies, tools, frameworks)</w:t>
-      </w:r>
-    </w:p>
-    <w:p>
-      <w:pPr>
-        <w:rPr/>
-      </w:pPr>
-      <w:r>
-        <w:rPr>
-          <w:rtl w:val="0"/>
-        </w:rPr>
-      </w:r>
-    </w:p>
-    <w:p>
-      <w:pPr>
-        <w:rPr>
-          <w:b w:val="1"/>
-          <w:bCs w:val="1"/>
-        </w:rPr>
-      </w:pPr>
-      <w:r>
-        <w:rPr>
-          <w:b w:val="1"/>
-          <w:bCs w:val="1"/>
-          <w:rtl w:val="0"/>
-        </w:rPr>
-        <w:t xml:space="preserve">Frontend Technologies:</w:t>
+        <w:t>Frontend Technologies:</w:t>
       </w:r>
     </w:p>
     <w:p>
@@ -621,15 +344,8 @@
           <w:ilvl w:val="0"/>
           <w:numId w:val="1"/>
         </w:numPr>
-        <w:ind w:left="720" w:hanging="360"/>
-        <w:rPr>
-          <w:u w:val="none"/>
-        </w:rPr>
-      </w:pPr>
-      <w:r>
-        <w:rPr>
-          <w:rtl w:val="0"/>
-        </w:rPr>
+      </w:pPr>
+      <w:r>
         <w:t xml:space="preserve">Bootstrap </w:t>
       </w:r>
     </w:p>
@@ -639,33 +355,24 @@
           <w:ilvl w:val="0"/>
           <w:numId w:val="1"/>
         </w:numPr>
-        <w:ind w:left="720" w:hanging="360"/>
+      </w:pPr>
+      <w:r>
+        <w:t>CSS Queries</w:t>
+      </w:r>
+    </w:p>
+    <w:p>
+      <w:pPr>
         <w:rPr>
-          <w:u w:val="none"/>
+          <w:b/>
+          <w:bCs/>
         </w:rPr>
       </w:pPr>
       <w:r>
         <w:rPr>
-          <w:rtl w:val="0"/>
+          <w:b/>
+          <w:bCs/>
         </w:rPr>
-        <w:t xml:space="preserve">CSS Queries</w:t>
-      </w:r>
-    </w:p>
-    <w:p>
-      <w:pPr>
-        <w:ind w:left="0" w:firstLine="0"/>
-        <w:rPr>
-          <w:b w:val="1"/>
-          <w:bCs w:val="1"/>
-        </w:rPr>
-      </w:pPr>
-      <w:r>
-        <w:rPr>
-          <w:b w:val="1"/>
-          <w:bCs w:val="1"/>
-          <w:rtl w:val="0"/>
-        </w:rPr>
-        <w:t xml:space="preserve">Backend technologies:</w:t>
+        <w:t>Backend technologies:</w:t>
       </w:r>
     </w:p>
     <w:p>
@@ -674,16 +381,9 @@
           <w:ilvl w:val="0"/>
           <w:numId w:val="2"/>
         </w:numPr>
-        <w:ind w:left="720" w:hanging="360"/>
-        <w:rPr>
-          <w:u w:val="none"/>
-        </w:rPr>
-      </w:pPr>
-      <w:r>
-        <w:rPr>
-          <w:rtl w:val="0"/>
-        </w:rPr>
-        <w:t xml:space="preserve">Spring framework</w:t>
+      </w:pPr>
+      <w:r>
+        <w:t>Spring framework</w:t>
       </w:r>
     </w:p>
     <w:p>
@@ -692,80 +392,83 @@
           <w:ilvl w:val="0"/>
           <w:numId w:val="2"/>
         </w:numPr>
-        <w:ind w:left="720" w:hanging="360"/>
+      </w:pPr>
+      <w:r>
+        <w:t>Movie database</w:t>
+      </w:r>
+    </w:p>
+    <w:p/>
+    <w:p>
+      <w:pPr>
+        <w:pStyle w:val="Heading3"/>
+        <w:spacing w:before="0" w:after="0"/>
+      </w:pPr>
+      <w:bookmarkStart w:id="14" w:name="_p7tt2humfkft" w:colFirst="0" w:colLast="0"/>
+      <w:bookmarkEnd w:id="14"/>
+      <w:r>
         <w:rPr>
-          <w:u w:val="none"/>
-        </w:rPr>
-      </w:pPr>
-      <w:r>
-        <w:rPr>
-          <w:rtl w:val="0"/>
-        </w:rPr>
-        <w:t xml:space="preserve">Movie database</w:t>
-      </w:r>
-      <w:r>
-        <w:rPr>
-          <w:rtl w:val="0"/>
-        </w:rPr>
-      </w:r>
-    </w:p>
-    <w:p>
-      <w:pPr>
-        <w:rPr/>
-      </w:pPr>
-      <w:r>
-        <w:rPr>
-          <w:rtl w:val="0"/>
-        </w:rPr>
-      </w:r>
-    </w:p>
-    <w:p>
-      <w:pPr>
-        <w:pStyle w:val="Heading3"/>
-        <w:spacing w:after="0" w:before="0" w:lineRule="auto"/>
-        <w:ind w:left="0" w:firstLine="0"/>
-        <w:rPr/>
-      </w:pPr>
-      <w:bookmarkStart w:colFirst="0" w:colLast="0" w:name="_p7tt2humfkft" w:id="14"/>
-      <w:bookmarkEnd w:id="14"/>
-      <w:r>
-        <w:rPr>
-          <w:rFonts w:ascii="Times New Roman" w:cs="Times New Roman" w:eastAsia="Times New Roman" w:hAnsi="Times New Roman"/>
+          <w:rFonts w:ascii="Times New Roman" w:eastAsia="Times New Roman" w:hAnsi="Times New Roman" w:cs="Times New Roman"/>
           <w:sz w:val="14"/>
           <w:szCs w:val="14"/>
-          <w:rtl w:val="0"/>
         </w:rPr>
         <w:t xml:space="preserve"> </w:t>
       </w:r>
       <w:r>
+        <w:t>Anticipated challenges / limitations / mitigations</w:t>
+      </w:r>
+    </w:p>
+    <w:p/>
+    <w:p>
+      <w:pPr>
         <w:rPr>
-          <w:rtl w:val="0"/>
+          <w:lang w:val="en-AE"/>
         </w:rPr>
-        <w:t xml:space="preserve">Anticipated challenges / limitations / mitigations</w:t>
-      </w:r>
-    </w:p>
-    <w:p>
-      <w:pPr>
-        <w:rPr/>
       </w:pPr>
       <w:r>
         <w:rPr>
-          <w:rtl w:val="0"/>
+          <w:lang w:val="en-AE"/>
         </w:rPr>
-      </w:r>
-    </w:p>
+        <w:t>Managing user accounts, reviews, and ratings may introduce complexity, particularly when allowing users to edit or delete their content. This can be mitigated through proper authentication, authorization, and validation mechanisms.</w:t>
+      </w:r>
+    </w:p>
+    <w:p>
+      <w:pPr>
+        <w:rPr>
+          <w:lang w:val="en-AE"/>
+        </w:rPr>
+      </w:pPr>
+      <w:r>
+        <w:rPr>
+          <w:lang w:val="en-AE"/>
+        </w:rPr>
+        <w:t>Implementing a recommendation system may be limited by time and data availability. This can be mitigated by using simple approaches such as genre-based or popularity-based recommendations.</w:t>
+      </w:r>
+    </w:p>
+    <w:p>
+      <w:pPr>
+        <w:rPr>
+          <w:lang w:val="en-AE"/>
+        </w:rPr>
+      </w:pPr>
+    </w:p>
+    <w:p/>
+    <w:p/>
     <w:sectPr>
-      <w:pgSz w:h="15840" w:w="12240" w:orient="portrait"/>
-      <w:pgMar w:bottom="1440" w:top="1440" w:left="1440" w:right="1440" w:header="720" w:footer="720"/>
+      <w:pgSz w:w="12240" w:h="15840"/>
+      <w:pgMar w:top="1440" w:right="1440" w:bottom="1440" w:left="1440" w:header="720" w:footer="720" w:gutter="0"/>
       <w:pgNumType w:start="1"/>
+      <w:cols w:space="720"/>
     </w:sectPr>
   </w:body>
 </w:document>
 </file>
 
 <file path=word/numbering.xml><?xml version="1.0" encoding="utf-8"?>
-<w:numbering xmlns:mc="http://schemas.openxmlformats.org/markup-compatibility/2006" xmlns:o="urn:schemas-microsoft-com:office:office" xmlns:r="http://schemas.openxmlformats.org/officeDocument/2006/relationships" xmlns:m="http://schemas.openxmlformats.org/officeDocument/2006/math" xmlns:v="urn:schemas-microsoft-com:vml" xmlns:wp="http://schemas.openxmlformats.org/drawingml/2006/wordprocessingDrawing" xmlns:w10="urn:schemas-microsoft-com:office:word" xmlns:w="http://schemas.openxmlformats.org/wordprocessingml/2006/main" xmlns:wne="http://schemas.microsoft.com/office/word/2006/wordml" xmlns:sl="http://schemas.openxmlformats.org/schemaLibrary/2006/main" xmlns:a="http://schemas.openxmlformats.org/drawingml/2006/main" xmlns:pic="http://schemas.openxmlformats.org/drawingml/2006/picture" xmlns:c="http://schemas.openxmlformats.org/drawingml/2006/chart" xmlns:lc="http://schemas.openxmlformats.org/drawingml/2006/lockedCanvas" xmlns:dgm="http://schemas.openxmlformats.org/drawingml/2006/diagram" xmlns:wps="http://schemas.microsoft.com/office/word/2010/wordprocessingShape" xmlns:wpg="http://schemas.microsoft.com/office/word/2010/wordprocessingGroup" xmlns:w14="http://schemas.microsoft.com/office/word/2010/wordml" xmlns:w15="http://schemas.microsoft.com/office/word/2012/wordml" xmlns:w16="http://schemas.microsoft.com/office/word/2018/wordml" xmlns:w16cex="http://schemas.microsoft.com/office/word/2018/wordml/cex" xmlns:w16cid="http://schemas.microsoft.com/office/word/2016/wordml/cid" xmlns="http://schemas.microsoft.com/office/tasks/2019/documenttasks" xmlns:cr="http://schemas.microsoft.com/office/comments/2020/reactions">
-  <w:abstractNum w:abstractNumId="1">
+<w:numbering xmlns:wpc="http://schemas.microsoft.com/office/word/2010/wordprocessingCanvas" xmlns:cx="http://schemas.microsoft.com/office/drawing/2014/chartex" xmlns:cx1="http://schemas.microsoft.com/office/drawing/2015/9/8/chartex" xmlns:cx2="http://schemas.microsoft.com/office/drawing/2015/10/21/chartex" xmlns:cx3="http://schemas.microsoft.com/office/drawing/2016/5/9/chartex" xmlns:cx4="http://schemas.microsoft.com/office/drawing/2016/5/10/chartex" xmlns:cx5="http://schemas.microsoft.com/office/drawing/2016/5/11/chartex" xmlns:cx6="http://schemas.microsoft.com/office/drawing/2016/5/12/chartex" xmlns:cx7="http://schemas.microsoft.com/office/drawing/2016/5/13/chartex" xmlns:cx8="http://schemas.microsoft.com/office/drawing/2016/5/14/chartex" xmlns:mc="http://schemas.openxmlformats.org/markup-compatibility/2006" xmlns:aink="http://schemas.microsoft.com/office/drawing/2016/ink" xmlns:am3d="http://schemas.microsoft.com/office/drawing/2017/model3d" xmlns:o="urn:schemas-microsoft-com:office:office" xmlns:oel="http://schemas.microsoft.com/office/2019/extlst" xmlns:r="http://schemas.openxmlformats.org/officeDocument/2006/relationships" xmlns:m="http://schemas.openxmlformats.org/officeDocument/2006/math" xmlns:v="urn:schemas-microsoft-com:vml" xmlns:wp14="http://schemas.microsoft.com/office/word/2010/wordprocessingDrawing" xmlns:wp="http://schemas.openxmlformats.org/drawingml/2006/wordprocessingDrawing" xmlns:w10="urn:schemas-microsoft-com:office:word" xmlns:w="http://schemas.openxmlformats.org/wordprocessingml/2006/main" xmlns:w14="http://schemas.microsoft.com/office/word/2010/wordml" xmlns:w15="http://schemas.microsoft.com/office/word/2012/wordml" xmlns:w16cex="http://schemas.microsoft.com/office/word/2018/wordml/cex" xmlns:w16cid="http://schemas.microsoft.com/office/word/2016/wordml/cid" xmlns:w16="http://schemas.microsoft.com/office/word/2018/wordml" xmlns:w16du="http://schemas.microsoft.com/office/word/2023/wordml/word16du" xmlns:w16sdtdh="http://schemas.microsoft.com/office/word/2020/wordml/sdtdatahash" xmlns:w16sdtfl="http://schemas.microsoft.com/office/word/2024/wordml/sdtformatlock" xmlns:w16se="http://schemas.microsoft.com/office/word/2015/wordml/symex" xmlns:wpg="http://schemas.microsoft.com/office/word/2010/wordprocessingGroup" xmlns:wpi="http://schemas.microsoft.com/office/word/2010/wordprocessingInk" xmlns:wne="http://schemas.microsoft.com/office/word/2006/wordml" xmlns:wps="http://schemas.microsoft.com/office/word/2010/wordprocessingShape" mc:Ignorable="w14 w15 w16se w16cid w16 w16cex w16sdtdh w16sdtfl w16du wp14">
+  <w:abstractNum w:abstractNumId="0" w15:restartNumberingAfterBreak="0">
+    <w:nsid w:val="2FA044D2"/>
+    <w:multiLevelType w:val="multilevel"/>
+    <w:tmpl w:val="E390B2EC"/>
     <w:lvl w:ilvl="0">
       <w:start w:val="1"/>
       <w:numFmt w:val="bullet"/>
@@ -875,7 +578,10 @@
       </w:rPr>
     </w:lvl>
   </w:abstractNum>
-  <w:abstractNum w:abstractNumId="2">
+  <w:abstractNum w:abstractNumId="1" w15:restartNumberingAfterBreak="0">
+    <w:nsid w:val="56246D80"/>
+    <w:multiLevelType w:val="multilevel"/>
+    <w:tmpl w:val="8730CE6E"/>
     <w:lvl w:ilvl="0">
       <w:start w:val="1"/>
       <w:numFmt w:val="bullet"/>
@@ -985,7 +691,10 @@
       </w:rPr>
     </w:lvl>
   </w:abstractNum>
-  <w:abstractNum w:abstractNumId="3">
+  <w:abstractNum w:abstractNumId="2" w15:restartNumberingAfterBreak="0">
+    <w:nsid w:val="592C2C67"/>
+    <w:multiLevelType w:val="multilevel"/>
+    <w:tmpl w:val="70B8A71C"/>
     <w:lvl w:ilvl="0">
       <w:start w:val="1"/>
       <w:numFmt w:val="bullet"/>
@@ -1095,27 +804,27 @@
       </w:rPr>
     </w:lvl>
   </w:abstractNum>
-  <w:num w:numId="1">
+  <w:num w:numId="1" w16cid:durableId="1761827441">
     <w:abstractNumId w:val="1"/>
   </w:num>
-  <w:num w:numId="2">
+  <w:num w:numId="2" w16cid:durableId="1541743875">
     <w:abstractNumId w:val="2"/>
   </w:num>
-  <w:num w:numId="3">
-    <w:abstractNumId w:val="3"/>
+  <w:num w:numId="3" w16cid:durableId="1109927963">
+    <w:abstractNumId w:val="0"/>
   </w:num>
 </w:numbering>
 </file>
 
 <file path=word/styles.xml><?xml version="1.0" encoding="utf-8"?>
-<w:styles xmlns:mc="http://schemas.openxmlformats.org/markup-compatibility/2006" xmlns:o="urn:schemas-microsoft-com:office:office" xmlns:r="http://schemas.openxmlformats.org/officeDocument/2006/relationships" xmlns:m="http://schemas.openxmlformats.org/officeDocument/2006/math" xmlns:v="urn:schemas-microsoft-com:vml" xmlns:wp="http://schemas.openxmlformats.org/drawingml/2006/wordprocessingDrawing" xmlns:w10="urn:schemas-microsoft-com:office:word" xmlns:w="http://schemas.openxmlformats.org/wordprocessingml/2006/main" xmlns:wne="http://schemas.microsoft.com/office/word/2006/wordml" xmlns:sl="http://schemas.openxmlformats.org/schemaLibrary/2006/main" xmlns:a="http://schemas.openxmlformats.org/drawingml/2006/main" xmlns:pic="http://schemas.openxmlformats.org/drawingml/2006/picture" xmlns:c="http://schemas.openxmlformats.org/drawingml/2006/chart" xmlns:lc="http://schemas.openxmlformats.org/drawingml/2006/lockedCanvas" xmlns:dgm="http://schemas.openxmlformats.org/drawingml/2006/diagram" xmlns:wps="http://schemas.microsoft.com/office/word/2010/wordprocessingShape" xmlns:wpg="http://schemas.microsoft.com/office/word/2010/wordprocessingGroup" xmlns:w14="http://schemas.microsoft.com/office/word/2010/wordml" xmlns:w15="http://schemas.microsoft.com/office/word/2012/wordml" xmlns:w16="http://schemas.microsoft.com/office/word/2018/wordml" xmlns:w16cex="http://schemas.microsoft.com/office/word/2018/wordml/cex" xmlns:w16cid="http://schemas.microsoft.com/office/word/2016/wordml/cid" xmlns="http://schemas.microsoft.com/office/tasks/2019/documenttasks" xmlns:cr="http://schemas.microsoft.com/office/comments/2020/reactions">
+<w:styles xmlns:mc="http://schemas.openxmlformats.org/markup-compatibility/2006" xmlns:r="http://schemas.openxmlformats.org/officeDocument/2006/relationships" xmlns:w="http://schemas.openxmlformats.org/wordprocessingml/2006/main" xmlns:w14="http://schemas.microsoft.com/office/word/2010/wordml" xmlns:w15="http://schemas.microsoft.com/office/word/2012/wordml" xmlns:w16cex="http://schemas.microsoft.com/office/word/2018/wordml/cex" xmlns:w16cid="http://schemas.microsoft.com/office/word/2016/wordml/cid" xmlns:w16="http://schemas.microsoft.com/office/word/2018/wordml" xmlns:w16du="http://schemas.microsoft.com/office/word/2023/wordml/word16du" xmlns:w16sdtdh="http://schemas.microsoft.com/office/word/2020/wordml/sdtdatahash" xmlns:w16sdtfl="http://schemas.microsoft.com/office/word/2024/wordml/sdtformatlock" xmlns:w16se="http://schemas.microsoft.com/office/word/2015/wordml/symex" mc:Ignorable="w14 w15 w16se w16cid w16 w16cex w16sdtdh w16sdtfl w16du">
   <w:docDefaults>
     <w:rPrDefault>
       <w:rPr>
-        <w:rFonts w:ascii="Arial" w:cs="Arial" w:eastAsia="Arial" w:hAnsi="Arial"/>
+        <w:rFonts w:ascii="Arial" w:eastAsia="Arial" w:hAnsi="Arial" w:cs="Arial"/>
         <w:sz w:val="22"/>
         <w:szCs w:val="22"/>
-        <w:lang w:val="en"/>
+        <w:lang w:val="en" w:eastAsia="en-AE" w:bidi="ar-SA"/>
       </w:rPr>
     </w:rPrDefault>
     <w:pPrDefault>
@@ -1124,29 +833,399 @@
       </w:pPr>
     </w:pPrDefault>
   </w:docDefaults>
-  <w:style w:type="table" w:styleId="TableNormal" w:default="1">
-    <w:name w:val="TableNormal"/>
-    <w:tblPr>
-      <w:tblCellMar>
-        <w:top w:w="100.0" w:type="dxa"/>
-        <w:left w:w="100.0" w:type="dxa"/>
-        <w:bottom w:w="100.0" w:type="dxa"/>
-        <w:right w:w="100.0" w:type="dxa"/>
-      </w:tblCellMar>
-    </w:tblPr>
-  </w:style>
-  <w:style w:type="paragraph" w:styleId="Normal" w:default="1">
-    <w:name w:val="normal"/>
+  <w:latentStyles w:defLockedState="0" w:defUIPriority="99" w:defSemiHidden="0" w:defUnhideWhenUsed="0" w:defQFormat="0" w:count="376">
+    <w:lsdException w:name="Normal" w:uiPriority="0" w:qFormat="1"/>
+    <w:lsdException w:name="heading 1" w:uiPriority="9" w:qFormat="1"/>
+    <w:lsdException w:name="heading 2" w:semiHidden="1" w:uiPriority="9" w:unhideWhenUsed="1" w:qFormat="1"/>
+    <w:lsdException w:name="heading 3" w:semiHidden="1" w:uiPriority="9" w:unhideWhenUsed="1" w:qFormat="1"/>
+    <w:lsdException w:name="heading 4" w:semiHidden="1" w:uiPriority="9" w:unhideWhenUsed="1" w:qFormat="1"/>
+    <w:lsdException w:name="heading 5" w:semiHidden="1" w:uiPriority="9" w:unhideWhenUsed="1" w:qFormat="1"/>
+    <w:lsdException w:name="heading 6" w:semiHidden="1" w:uiPriority="9" w:unhideWhenUsed="1" w:qFormat="1"/>
+    <w:lsdException w:name="heading 7" w:semiHidden="1" w:uiPriority="9" w:unhideWhenUsed="1" w:qFormat="1"/>
+    <w:lsdException w:name="heading 8" w:semiHidden="1" w:uiPriority="9" w:unhideWhenUsed="1" w:qFormat="1"/>
+    <w:lsdException w:name="heading 9" w:semiHidden="1" w:uiPriority="9" w:unhideWhenUsed="1" w:qFormat="1"/>
+    <w:lsdException w:name="index 1" w:semiHidden="1" w:unhideWhenUsed="1"/>
+    <w:lsdException w:name="index 2" w:semiHidden="1" w:unhideWhenUsed="1"/>
+    <w:lsdException w:name="index 3" w:semiHidden="1" w:unhideWhenUsed="1"/>
+    <w:lsdException w:name="index 4" w:semiHidden="1" w:unhideWhenUsed="1"/>
+    <w:lsdException w:name="index 5" w:semiHidden="1" w:unhideWhenUsed="1"/>
+    <w:lsdException w:name="index 6" w:semiHidden="1" w:unhideWhenUsed="1"/>
+    <w:lsdException w:name="index 7" w:semiHidden="1" w:unhideWhenUsed="1"/>
+    <w:lsdException w:name="index 8" w:semiHidden="1" w:unhideWhenUsed="1"/>
+    <w:lsdException w:name="index 9" w:semiHidden="1" w:unhideWhenUsed="1"/>
+    <w:lsdException w:name="toc 1" w:semiHidden="1" w:uiPriority="39" w:unhideWhenUsed="1"/>
+    <w:lsdException w:name="toc 2" w:semiHidden="1" w:uiPriority="39" w:unhideWhenUsed="1"/>
+    <w:lsdException w:name="toc 3" w:semiHidden="1" w:uiPriority="39" w:unhideWhenUsed="1"/>
+    <w:lsdException w:name="toc 4" w:semiHidden="1" w:uiPriority="39" w:unhideWhenUsed="1"/>
+    <w:lsdException w:name="toc 5" w:semiHidden="1" w:uiPriority="39" w:unhideWhenUsed="1"/>
+    <w:lsdException w:name="toc 6" w:semiHidden="1" w:uiPriority="39" w:unhideWhenUsed="1"/>
+    <w:lsdException w:name="toc 7" w:semiHidden="1" w:uiPriority="39" w:unhideWhenUsed="1"/>
+    <w:lsdException w:name="toc 8" w:semiHidden="1" w:uiPriority="39" w:unhideWhenUsed="1"/>
+    <w:lsdException w:name="toc 9" w:semiHidden="1" w:uiPriority="39" w:unhideWhenUsed="1"/>
+    <w:lsdException w:name="Normal Indent" w:semiHidden="1" w:unhideWhenUsed="1"/>
+    <w:lsdException w:name="footnote text" w:semiHidden="1" w:unhideWhenUsed="1"/>
+    <w:lsdException w:name="annotation text" w:semiHidden="1" w:unhideWhenUsed="1"/>
+    <w:lsdException w:name="header" w:semiHidden="1" w:unhideWhenUsed="1"/>
+    <w:lsdException w:name="footer" w:semiHidden="1" w:unhideWhenUsed="1"/>
+    <w:lsdException w:name="index heading" w:semiHidden="1" w:unhideWhenUsed="1"/>
+    <w:lsdException w:name="caption" w:semiHidden="1" w:uiPriority="35" w:unhideWhenUsed="1" w:qFormat="1"/>
+    <w:lsdException w:name="table of figures" w:semiHidden="1" w:unhideWhenUsed="1"/>
+    <w:lsdException w:name="envelope address" w:semiHidden="1" w:unhideWhenUsed="1"/>
+    <w:lsdException w:name="envelope return" w:semiHidden="1" w:unhideWhenUsed="1"/>
+    <w:lsdException w:name="footnote reference" w:semiHidden="1" w:unhideWhenUsed="1"/>
+    <w:lsdException w:name="annotation reference" w:semiHidden="1" w:unhideWhenUsed="1"/>
+    <w:lsdException w:name="line number" w:semiHidden="1" w:unhideWhenUsed="1"/>
+    <w:lsdException w:name="page number" w:semiHidden="1" w:unhideWhenUsed="1"/>
+    <w:lsdException w:name="endnote reference" w:semiHidden="1" w:unhideWhenUsed="1"/>
+    <w:lsdException w:name="endnote text" w:semiHidden="1" w:unhideWhenUsed="1"/>
+    <w:lsdException w:name="table of authorities" w:semiHidden="1" w:unhideWhenUsed="1"/>
+    <w:lsdException w:name="macro" w:semiHidden="1" w:unhideWhenUsed="1"/>
+    <w:lsdException w:name="toa heading" w:semiHidden="1" w:unhideWhenUsed="1"/>
+    <w:lsdException w:name="List" w:semiHidden="1" w:unhideWhenUsed="1"/>
+    <w:lsdException w:name="List Bullet" w:semiHidden="1" w:unhideWhenUsed="1"/>
+    <w:lsdException w:name="List Number" w:semiHidden="1" w:unhideWhenUsed="1"/>
+    <w:lsdException w:name="List 2" w:semiHidden="1" w:unhideWhenUsed="1"/>
+    <w:lsdException w:name="List 3" w:semiHidden="1" w:unhideWhenUsed="1"/>
+    <w:lsdException w:name="List 4" w:semiHidden="1" w:unhideWhenUsed="1"/>
+    <w:lsdException w:name="List 5" w:semiHidden="1" w:unhideWhenUsed="1"/>
+    <w:lsdException w:name="List Bullet 2" w:semiHidden="1" w:unhideWhenUsed="1"/>
+    <w:lsdException w:name="List Bullet 3" w:semiHidden="1" w:unhideWhenUsed="1"/>
+    <w:lsdException w:name="List Bullet 4" w:semiHidden="1" w:unhideWhenUsed="1"/>
+    <w:lsdException w:name="List Bullet 5" w:semiHidden="1" w:unhideWhenUsed="1"/>
+    <w:lsdException w:name="List Number 2" w:semiHidden="1" w:unhideWhenUsed="1"/>
+    <w:lsdException w:name="List Number 3" w:semiHidden="1" w:unhideWhenUsed="1"/>
+    <w:lsdException w:name="List Number 4" w:semiHidden="1" w:unhideWhenUsed="1"/>
+    <w:lsdException w:name="List Number 5" w:semiHidden="1" w:unhideWhenUsed="1"/>
+    <w:lsdException w:name="Title" w:uiPriority="10" w:qFormat="1"/>
+    <w:lsdException w:name="Closing" w:semiHidden="1" w:unhideWhenUsed="1"/>
+    <w:lsdException w:name="Signature" w:semiHidden="1" w:unhideWhenUsed="1"/>
+    <w:lsdException w:name="Default Paragraph Font" w:semiHidden="1" w:uiPriority="1" w:unhideWhenUsed="1"/>
+    <w:lsdException w:name="Body Text" w:semiHidden="1" w:unhideWhenUsed="1"/>
+    <w:lsdException w:name="Body Text Indent" w:semiHidden="1" w:unhideWhenUsed="1"/>
+    <w:lsdException w:name="List Continue" w:semiHidden="1" w:unhideWhenUsed="1"/>
+    <w:lsdException w:name="List Continue 2" w:semiHidden="1" w:unhideWhenUsed="1"/>
+    <w:lsdException w:name="List Continue 3" w:semiHidden="1" w:unhideWhenUsed="1"/>
+    <w:lsdException w:name="List Continue 4" w:semiHidden="1" w:unhideWhenUsed="1"/>
+    <w:lsdException w:name="List Continue 5" w:semiHidden="1" w:unhideWhenUsed="1"/>
+    <w:lsdException w:name="Message Header" w:semiHidden="1" w:unhideWhenUsed="1"/>
+    <w:lsdException w:name="Subtitle" w:uiPriority="11" w:qFormat="1"/>
+    <w:lsdException w:name="Salutation" w:semiHidden="1" w:unhideWhenUsed="1"/>
+    <w:lsdException w:name="Date" w:semiHidden="1" w:unhideWhenUsed="1"/>
+    <w:lsdException w:name="Body Text First Indent" w:semiHidden="1" w:unhideWhenUsed="1"/>
+    <w:lsdException w:name="Body Text First Indent 2" w:semiHidden="1" w:unhideWhenUsed="1"/>
+    <w:lsdException w:name="Note Heading" w:semiHidden="1" w:unhideWhenUsed="1"/>
+    <w:lsdException w:name="Body Text 2" w:semiHidden="1" w:unhideWhenUsed="1"/>
+    <w:lsdException w:name="Body Text 3" w:semiHidden="1" w:unhideWhenUsed="1"/>
+    <w:lsdException w:name="Body Text Indent 2" w:semiHidden="1" w:unhideWhenUsed="1"/>
+    <w:lsdException w:name="Body Text Indent 3" w:semiHidden="1" w:unhideWhenUsed="1"/>
+    <w:lsdException w:name="Block Text" w:semiHidden="1" w:unhideWhenUsed="1"/>
+    <w:lsdException w:name="Hyperlink" w:semiHidden="1" w:unhideWhenUsed="1"/>
+    <w:lsdException w:name="FollowedHyperlink" w:semiHidden="1" w:unhideWhenUsed="1"/>
+    <w:lsdException w:name="Strong" w:uiPriority="22" w:qFormat="1"/>
+    <w:lsdException w:name="Emphasis" w:uiPriority="20" w:qFormat="1"/>
+    <w:lsdException w:name="Document Map" w:semiHidden="1" w:unhideWhenUsed="1"/>
+    <w:lsdException w:name="Plain Text" w:semiHidden="1" w:unhideWhenUsed="1"/>
+    <w:lsdException w:name="E-mail Signature" w:semiHidden="1" w:unhideWhenUsed="1"/>
+    <w:lsdException w:name="HTML Top of Form" w:semiHidden="1" w:unhideWhenUsed="1"/>
+    <w:lsdException w:name="HTML Bottom of Form" w:semiHidden="1" w:unhideWhenUsed="1"/>
+    <w:lsdException w:name="Normal (Web)" w:semiHidden="1" w:unhideWhenUsed="1"/>
+    <w:lsdException w:name="HTML Acronym" w:semiHidden="1" w:unhideWhenUsed="1"/>
+    <w:lsdException w:name="HTML Address" w:semiHidden="1" w:unhideWhenUsed="1"/>
+    <w:lsdException w:name="HTML Cite" w:semiHidden="1" w:unhideWhenUsed="1"/>
+    <w:lsdException w:name="HTML Code" w:semiHidden="1" w:unhideWhenUsed="1"/>
+    <w:lsdException w:name="HTML Definition" w:semiHidden="1" w:unhideWhenUsed="1"/>
+    <w:lsdException w:name="HTML Keyboard" w:semiHidden="1" w:unhideWhenUsed="1"/>
+    <w:lsdException w:name="HTML Preformatted" w:semiHidden="1" w:unhideWhenUsed="1"/>
+    <w:lsdException w:name="HTML Sample" w:semiHidden="1" w:unhideWhenUsed="1"/>
+    <w:lsdException w:name="HTML Typewriter" w:semiHidden="1" w:unhideWhenUsed="1"/>
+    <w:lsdException w:name="HTML Variable" w:semiHidden="1" w:unhideWhenUsed="1"/>
+    <w:lsdException w:name="Normal Table" w:semiHidden="1" w:unhideWhenUsed="1"/>
+    <w:lsdException w:name="annotation subject" w:semiHidden="1" w:unhideWhenUsed="1"/>
+    <w:lsdException w:name="No List" w:semiHidden="1" w:unhideWhenUsed="1"/>
+    <w:lsdException w:name="Outline List 1" w:semiHidden="1" w:unhideWhenUsed="1"/>
+    <w:lsdException w:name="Outline List 2" w:semiHidden="1" w:unhideWhenUsed="1"/>
+    <w:lsdException w:name="Outline List 3" w:semiHidden="1" w:unhideWhenUsed="1"/>
+    <w:lsdException w:name="Table Simple 1" w:semiHidden="1" w:unhideWhenUsed="1"/>
+    <w:lsdException w:name="Table Simple 2" w:semiHidden="1" w:unhideWhenUsed="1"/>
+    <w:lsdException w:name="Table Simple 3" w:semiHidden="1" w:unhideWhenUsed="1"/>
+    <w:lsdException w:name="Table Classic 1" w:semiHidden="1" w:unhideWhenUsed="1"/>
+    <w:lsdException w:name="Table Classic 2" w:semiHidden="1" w:unhideWhenUsed="1"/>
+    <w:lsdException w:name="Table Classic 3" w:semiHidden="1" w:unhideWhenUsed="1"/>
+    <w:lsdException w:name="Table Classic 4" w:semiHidden="1" w:unhideWhenUsed="1"/>
+    <w:lsdException w:name="Table Colorful 1" w:semiHidden="1" w:unhideWhenUsed="1"/>
+    <w:lsdException w:name="Table Colorful 2" w:semiHidden="1" w:unhideWhenUsed="1"/>
+    <w:lsdException w:name="Table Colorful 3" w:semiHidden="1" w:unhideWhenUsed="1"/>
+    <w:lsdException w:name="Table Columns 1" w:semiHidden="1" w:unhideWhenUsed="1"/>
+    <w:lsdException w:name="Table Columns 2" w:semiHidden="1" w:unhideWhenUsed="1"/>
+    <w:lsdException w:name="Table Columns 3" w:semiHidden="1" w:unhideWhenUsed="1"/>
+    <w:lsdException w:name="Table Columns 4" w:semiHidden="1" w:unhideWhenUsed="1"/>
+    <w:lsdException w:name="Table Columns 5" w:semiHidden="1" w:unhideWhenUsed="1"/>
+    <w:lsdException w:name="Table Grid 1" w:semiHidden="1" w:unhideWhenUsed="1"/>
+    <w:lsdException w:name="Table Grid 2" w:semiHidden="1" w:unhideWhenUsed="1"/>
+    <w:lsdException w:name="Table Grid 3" w:semiHidden="1" w:unhideWhenUsed="1"/>
+    <w:lsdException w:name="Table Grid 4" w:semiHidden="1" w:unhideWhenUsed="1"/>
+    <w:lsdException w:name="Table Grid 5" w:semiHidden="1" w:unhideWhenUsed="1"/>
+    <w:lsdException w:name="Table Grid 6" w:semiHidden="1" w:unhideWhenUsed="1"/>
+    <w:lsdException w:name="Table Grid 7" w:semiHidden="1" w:unhideWhenUsed="1"/>
+    <w:lsdException w:name="Table Grid 8" w:semiHidden="1" w:unhideWhenUsed="1"/>
+    <w:lsdException w:name="Table List 1" w:semiHidden="1" w:unhideWhenUsed="1"/>
+    <w:lsdException w:name="Table List 2" w:semiHidden="1" w:unhideWhenUsed="1"/>
+    <w:lsdException w:name="Table List 3" w:semiHidden="1" w:unhideWhenUsed="1"/>
+    <w:lsdException w:name="Table List 4" w:semiHidden="1" w:unhideWhenUsed="1"/>
+    <w:lsdException w:name="Table List 5" w:semiHidden="1" w:unhideWhenUsed="1"/>
+    <w:lsdException w:name="Table List 6" w:semiHidden="1" w:unhideWhenUsed="1"/>
+    <w:lsdException w:name="Table List 7" w:semiHidden="1" w:unhideWhenUsed="1"/>
+    <w:lsdException w:name="Table List 8" w:semiHidden="1" w:unhideWhenUsed="1"/>
+    <w:lsdException w:name="Table 3D effects 1" w:semiHidden="1" w:unhideWhenUsed="1"/>
+    <w:lsdException w:name="Table 3D effects 2" w:semiHidden="1" w:unhideWhenUsed="1"/>
+    <w:lsdException w:name="Table 3D effects 3" w:semiHidden="1" w:unhideWhenUsed="1"/>
+    <w:lsdException w:name="Table Contemporary" w:semiHidden="1" w:unhideWhenUsed="1"/>
+    <w:lsdException w:name="Table Elegant" w:semiHidden="1" w:unhideWhenUsed="1"/>
+    <w:lsdException w:name="Table Professional" w:semiHidden="1" w:unhideWhenUsed="1"/>
+    <w:lsdException w:name="Table Subtle 1" w:semiHidden="1" w:unhideWhenUsed="1"/>
+    <w:lsdException w:name="Table Subtle 2" w:semiHidden="1" w:unhideWhenUsed="1"/>
+    <w:lsdException w:name="Table Web 1" w:semiHidden="1" w:unhideWhenUsed="1"/>
+    <w:lsdException w:name="Table Web 2" w:semiHidden="1" w:unhideWhenUsed="1"/>
+    <w:lsdException w:name="Table Web 3" w:semiHidden="1" w:unhideWhenUsed="1"/>
+    <w:lsdException w:name="Balloon Text" w:semiHidden="1" w:unhideWhenUsed="1"/>
+    <w:lsdException w:name="Table Grid" w:uiPriority="39"/>
+    <w:lsdException w:name="Table Theme" w:semiHidden="1" w:unhideWhenUsed="1"/>
+    <w:lsdException w:name="Placeholder Text" w:semiHidden="1"/>
+    <w:lsdException w:name="No Spacing" w:uiPriority="1" w:qFormat="1"/>
+    <w:lsdException w:name="Light Shading" w:uiPriority="60"/>
+    <w:lsdException w:name="Light List" w:uiPriority="61"/>
+    <w:lsdException w:name="Light Grid" w:uiPriority="62"/>
+    <w:lsdException w:name="Medium Shading 1" w:uiPriority="63"/>
+    <w:lsdException w:name="Medium Shading 2" w:uiPriority="64"/>
+    <w:lsdException w:name="Medium List 1" w:uiPriority="65"/>
+    <w:lsdException w:name="Medium List 2" w:uiPriority="66"/>
+    <w:lsdException w:name="Medium Grid 1" w:uiPriority="67"/>
+    <w:lsdException w:name="Medium Grid 2" w:uiPriority="68"/>
+    <w:lsdException w:name="Medium Grid 3" w:uiPriority="69"/>
+    <w:lsdException w:name="Dark List" w:uiPriority="70"/>
+    <w:lsdException w:name="Colorful Shading" w:uiPriority="71"/>
+    <w:lsdException w:name="Colorful List" w:uiPriority="72"/>
+    <w:lsdException w:name="Colorful Grid" w:uiPriority="73"/>
+    <w:lsdException w:name="Light Shading Accent 1" w:uiPriority="60"/>
+    <w:lsdException w:name="Light List Accent 1" w:uiPriority="61"/>
+    <w:lsdException w:name="Light Grid Accent 1" w:uiPriority="62"/>
+    <w:lsdException w:name="Medium Shading 1 Accent 1" w:uiPriority="63"/>
+    <w:lsdException w:name="Medium Shading 2 Accent 1" w:uiPriority="64"/>
+    <w:lsdException w:name="Medium List 1 Accent 1" w:uiPriority="65"/>
+    <w:lsdException w:name="Revision" w:semiHidden="1"/>
+    <w:lsdException w:name="List Paragraph" w:uiPriority="34" w:qFormat="1"/>
+    <w:lsdException w:name="Quote" w:uiPriority="29" w:qFormat="1"/>
+    <w:lsdException w:name="Intense Quote" w:uiPriority="30" w:qFormat="1"/>
+    <w:lsdException w:name="Medium List 2 Accent 1" w:uiPriority="66"/>
+    <w:lsdException w:name="Medium Grid 1 Accent 1" w:uiPriority="67"/>
+    <w:lsdException w:name="Medium Grid 2 Accent 1" w:uiPriority="68"/>
+    <w:lsdException w:name="Medium Grid 3 Accent 1" w:uiPriority="69"/>
+    <w:lsdException w:name="Dark List Accent 1" w:uiPriority="70"/>
+    <w:lsdException w:name="Colorful Shading Accent 1" w:uiPriority="71"/>
+    <w:lsdException w:name="Colorful List Accent 1" w:uiPriority="72"/>
+    <w:lsdException w:name="Colorful Grid Accent 1" w:uiPriority="73"/>
+    <w:lsdException w:name="Light Shading Accent 2" w:uiPriority="60"/>
+    <w:lsdException w:name="Light List Accent 2" w:uiPriority="61"/>
+    <w:lsdException w:name="Light Grid Accent 2" w:uiPriority="62"/>
+    <w:lsdException w:name="Medium Shading 1 Accent 2" w:uiPriority="63"/>
+    <w:lsdException w:name="Medium Shading 2 Accent 2" w:uiPriority="64"/>
+    <w:lsdException w:name="Medium List 1 Accent 2" w:uiPriority="65"/>
+    <w:lsdException w:name="Medium List 2 Accent 2" w:uiPriority="66"/>
+    <w:lsdException w:name="Medium Grid 1 Accent 2" w:uiPriority="67"/>
+    <w:lsdException w:name="Medium Grid 2 Accent 2" w:uiPriority="68"/>
+    <w:lsdException w:name="Medium Grid 3 Accent 2" w:uiPriority="69"/>
+    <w:lsdException w:name="Dark List Accent 2" w:uiPriority="70"/>
+    <w:lsdException w:name="Colorful Shading Accent 2" w:uiPriority="71"/>
+    <w:lsdException w:name="Colorful List Accent 2" w:uiPriority="72"/>
+    <w:lsdException w:name="Colorful Grid Accent 2" w:uiPriority="73"/>
+    <w:lsdException w:name="Light Shading Accent 3" w:uiPriority="60"/>
+    <w:lsdException w:name="Light List Accent 3" w:uiPriority="61"/>
+    <w:lsdException w:name="Light Grid Accent 3" w:uiPriority="62"/>
+    <w:lsdException w:name="Medium Shading 1 Accent 3" w:uiPriority="63"/>
+    <w:lsdException w:name="Medium Shading 2 Accent 3" w:uiPriority="64"/>
+    <w:lsdException w:name="Medium List 1 Accent 3" w:uiPriority="65"/>
+    <w:lsdException w:name="Medium List 2 Accent 3" w:uiPriority="66"/>
+    <w:lsdException w:name="Medium Grid 1 Accent 3" w:uiPriority="67"/>
+    <w:lsdException w:name="Medium Grid 2 Accent 3" w:uiPriority="68"/>
+    <w:lsdException w:name="Medium Grid 3 Accent 3" w:uiPriority="69"/>
+    <w:lsdException w:name="Dark List Accent 3" w:uiPriority="70"/>
+    <w:lsdException w:name="Colorful Shading Accent 3" w:uiPriority="71"/>
+    <w:lsdException w:name="Colorful List Accent 3" w:uiPriority="72"/>
+    <w:lsdException w:name="Colorful Grid Accent 3" w:uiPriority="73"/>
+    <w:lsdException w:name="Light Shading Accent 4" w:uiPriority="60"/>
+    <w:lsdException w:name="Light List Accent 4" w:uiPriority="61"/>
+    <w:lsdException w:name="Light Grid Accent 4" w:uiPriority="62"/>
+    <w:lsdException w:name="Medium Shading 1 Accent 4" w:uiPriority="63"/>
+    <w:lsdException w:name="Medium Shading 2 Accent 4" w:uiPriority="64"/>
+    <w:lsdException w:name="Medium List 1 Accent 4" w:uiPriority="65"/>
+    <w:lsdException w:name="Medium List 2 Accent 4" w:uiPriority="66"/>
+    <w:lsdException w:name="Medium Grid 1 Accent 4" w:uiPriority="67"/>
+    <w:lsdException w:name="Medium Grid 2 Accent 4" w:uiPriority="68"/>
+    <w:lsdException w:name="Medium Grid 3 Accent 4" w:uiPriority="69"/>
+    <w:lsdException w:name="Dark List Accent 4" w:uiPriority="70"/>
+    <w:lsdException w:name="Colorful Shading Accent 4" w:uiPriority="71"/>
+    <w:lsdException w:name="Colorful List Accent 4" w:uiPriority="72"/>
+    <w:lsdException w:name="Colorful Grid Accent 4" w:uiPriority="73"/>
+    <w:lsdException w:name="Light Shading Accent 5" w:uiPriority="60"/>
+    <w:lsdException w:name="Light List Accent 5" w:uiPriority="61"/>
+    <w:lsdException w:name="Light Grid Accent 5" w:uiPriority="62"/>
+    <w:lsdException w:name="Medium Shading 1 Accent 5" w:uiPriority="63"/>
+    <w:lsdException w:name="Medium Shading 2 Accent 5" w:uiPriority="64"/>
+    <w:lsdException w:name="Medium List 1 Accent 5" w:uiPriority="65"/>
+    <w:lsdException w:name="Medium List 2 Accent 5" w:uiPriority="66"/>
+    <w:lsdException w:name="Medium Grid 1 Accent 5" w:uiPriority="67"/>
+    <w:lsdException w:name="Medium Grid 2 Accent 5" w:uiPriority="68"/>
+    <w:lsdException w:name="Medium Grid 3 Accent 5" w:uiPriority="69"/>
+    <w:lsdException w:name="Dark List Accent 5" w:uiPriority="70"/>
+    <w:lsdException w:name="Colorful Shading Accent 5" w:uiPriority="71"/>
+    <w:lsdException w:name="Colorful List Accent 5" w:uiPriority="72"/>
+    <w:lsdException w:name="Colorful Grid Accent 5" w:uiPriority="73"/>
+    <w:lsdException w:name="Light Shading Accent 6" w:uiPriority="60"/>
+    <w:lsdException w:name="Light List Accent 6" w:uiPriority="61"/>
+    <w:lsdException w:name="Light Grid Accent 6" w:uiPriority="62"/>
+    <w:lsdException w:name="Medium Shading 1 Accent 6" w:uiPriority="63"/>
+    <w:lsdException w:name="Medium Shading 2 Accent 6" w:uiPriority="64"/>
+    <w:lsdException w:name="Medium List 1 Accent 6" w:uiPriority="65"/>
+    <w:lsdException w:name="Medium List 2 Accent 6" w:uiPriority="66"/>
+    <w:lsdException w:name="Medium Grid 1 Accent 6" w:uiPriority="67"/>
+    <w:lsdException w:name="Medium Grid 2 Accent 6" w:uiPriority="68"/>
+    <w:lsdException w:name="Medium Grid 3 Accent 6" w:uiPriority="69"/>
+    <w:lsdException w:name="Dark List Accent 6" w:uiPriority="70"/>
+    <w:lsdException w:name="Colorful Shading Accent 6" w:uiPriority="71"/>
+    <w:lsdException w:name="Colorful List Accent 6" w:uiPriority="72"/>
+    <w:lsdException w:name="Colorful Grid Accent 6" w:uiPriority="73"/>
+    <w:lsdException w:name="Subtle Emphasis" w:uiPriority="19" w:qFormat="1"/>
+    <w:lsdException w:name="Intense Emphasis" w:uiPriority="21" w:qFormat="1"/>
+    <w:lsdException w:name="Subtle Reference" w:uiPriority="31" w:qFormat="1"/>
+    <w:lsdException w:name="Intense Reference" w:uiPriority="32" w:qFormat="1"/>
+    <w:lsdException w:name="Book Title" w:uiPriority="33" w:qFormat="1"/>
+    <w:lsdException w:name="Bibliography" w:semiHidden="1" w:uiPriority="37" w:unhideWhenUsed="1"/>
+    <w:lsdException w:name="TOC Heading" w:semiHidden="1" w:uiPriority="39" w:unhideWhenUsed="1" w:qFormat="1"/>
+    <w:lsdException w:name="Plain Table 1" w:uiPriority="41"/>
+    <w:lsdException w:name="Plain Table 2" w:uiPriority="42"/>
+    <w:lsdException w:name="Plain Table 3" w:uiPriority="43"/>
+    <w:lsdException w:name="Plain Table 4" w:uiPriority="44"/>
+    <w:lsdException w:name="Plain Table 5" w:uiPriority="45"/>
+    <w:lsdException w:name="Grid Table Light" w:uiPriority="40"/>
+    <w:lsdException w:name="Grid Table 1 Light" w:uiPriority="46"/>
+    <w:lsdException w:name="Grid Table 2" w:uiPriority="47"/>
+    <w:lsdException w:name="Grid Table 3" w:uiPriority="48"/>
+    <w:lsdException w:name="Grid Table 4" w:uiPriority="49"/>
+    <w:lsdException w:name="Grid Table 5 Dark" w:uiPriority="50"/>
+    <w:lsdException w:name="Grid Table 6 Colorful" w:uiPriority="51"/>
+    <w:lsdException w:name="Grid Table 7 Colorful" w:uiPriority="52"/>
+    <w:lsdException w:name="Grid Table 1 Light Accent 1" w:uiPriority="46"/>
+    <w:lsdException w:name="Grid Table 2 Accent 1" w:uiPriority="47"/>
+    <w:lsdException w:name="Grid Table 3 Accent 1" w:uiPriority="48"/>
+    <w:lsdException w:name="Grid Table 4 Accent 1" w:uiPriority="49"/>
+    <w:lsdException w:name="Grid Table 5 Dark Accent 1" w:uiPriority="50"/>
+    <w:lsdException w:name="Grid Table 6 Colorful Accent 1" w:uiPriority="51"/>
+    <w:lsdException w:name="Grid Table 7 Colorful Accent 1" w:uiPriority="52"/>
+    <w:lsdException w:name="Grid Table 1 Light Accent 2" w:uiPriority="46"/>
+    <w:lsdException w:name="Grid Table 2 Accent 2" w:uiPriority="47"/>
+    <w:lsdException w:name="Grid Table 3 Accent 2" w:uiPriority="48"/>
+    <w:lsdException w:name="Grid Table 4 Accent 2" w:uiPriority="49"/>
+    <w:lsdException w:name="Grid Table 5 Dark Accent 2" w:uiPriority="50"/>
+    <w:lsdException w:name="Grid Table 6 Colorful Accent 2" w:uiPriority="51"/>
+    <w:lsdException w:name="Grid Table 7 Colorful Accent 2" w:uiPriority="52"/>
+    <w:lsdException w:name="Grid Table 1 Light Accent 3" w:uiPriority="46"/>
+    <w:lsdException w:name="Grid Table 2 Accent 3" w:uiPriority="47"/>
+    <w:lsdException w:name="Grid Table 3 Accent 3" w:uiPriority="48"/>
+    <w:lsdException w:name="Grid Table 4 Accent 3" w:uiPriority="49"/>
+    <w:lsdException w:name="Grid Table 5 Dark Accent 3" w:uiPriority="50"/>
+    <w:lsdException w:name="Grid Table 6 Colorful Accent 3" w:uiPriority="51"/>
+    <w:lsdException w:name="Grid Table 7 Colorful Accent 3" w:uiPriority="52"/>
+    <w:lsdException w:name="Grid Table 1 Light Accent 4" w:uiPriority="46"/>
+    <w:lsdException w:name="Grid Table 2 Accent 4" w:uiPriority="47"/>
+    <w:lsdException w:name="Grid Table 3 Accent 4" w:uiPriority="48"/>
+    <w:lsdException w:name="Grid Table 4 Accent 4" w:uiPriority="49"/>
+    <w:lsdException w:name="Grid Table 5 Dark Accent 4" w:uiPriority="50"/>
+    <w:lsdException w:name="Grid Table 6 Colorful Accent 4" w:uiPriority="51"/>
+    <w:lsdException w:name="Grid Table 7 Colorful Accent 4" w:uiPriority="52"/>
+    <w:lsdException w:name="Grid Table 1 Light Accent 5" w:uiPriority="46"/>
+    <w:lsdException w:name="Grid Table 2 Accent 5" w:uiPriority="47"/>
+    <w:lsdException w:name="Grid Table 3 Accent 5" w:uiPriority="48"/>
+    <w:lsdException w:name="Grid Table 4 Accent 5" w:uiPriority="49"/>
+    <w:lsdException w:name="Grid Table 5 Dark Accent 5" w:uiPriority="50"/>
+    <w:lsdException w:name="Grid Table 6 Colorful Accent 5" w:uiPriority="51"/>
+    <w:lsdException w:name="Grid Table 7 Colorful Accent 5" w:uiPriority="52"/>
+    <w:lsdException w:name="Grid Table 1 Light Accent 6" w:uiPriority="46"/>
+    <w:lsdException w:name="Grid Table 2 Accent 6" w:uiPriority="47"/>
+    <w:lsdException w:name="Grid Table 3 Accent 6" w:uiPriority="48"/>
+    <w:lsdException w:name="Grid Table 4 Accent 6" w:uiPriority="49"/>
+    <w:lsdException w:name="Grid Table 5 Dark Accent 6" w:uiPriority="50"/>
+    <w:lsdException w:name="Grid Table 6 Colorful Accent 6" w:uiPriority="51"/>
+    <w:lsdException w:name="Grid Table 7 Colorful Accent 6" w:uiPriority="52"/>
+    <w:lsdException w:name="List Table 1 Light" w:uiPriority="46"/>
+    <w:lsdException w:name="List Table 2" w:uiPriority="47"/>
+    <w:lsdException w:name="List Table 3" w:uiPriority="48"/>
+    <w:lsdException w:name="List Table 4" w:uiPriority="49"/>
+    <w:lsdException w:name="List Table 5 Dark" w:uiPriority="50"/>
+    <w:lsdException w:name="List Table 6 Colorful" w:uiPriority="51"/>
+    <w:lsdException w:name="List Table 7 Colorful" w:uiPriority="52"/>
+    <w:lsdException w:name="List Table 1 Light Accent 1" w:uiPriority="46"/>
+    <w:lsdException w:name="List Table 2 Accent 1" w:uiPriority="47"/>
+    <w:lsdException w:name="List Table 3 Accent 1" w:uiPriority="48"/>
+    <w:lsdException w:name="List Table 4 Accent 1" w:uiPriority="49"/>
+    <w:lsdException w:name="List Table 5 Dark Accent 1" w:uiPriority="50"/>
+    <w:lsdException w:name="List Table 6 Colorful Accent 1" w:uiPriority="51"/>
+    <w:lsdException w:name="List Table 7 Colorful Accent 1" w:uiPriority="52"/>
+    <w:lsdException w:name="List Table 1 Light Accent 2" w:uiPriority="46"/>
+    <w:lsdException w:name="List Table 2 Accent 2" w:uiPriority="47"/>
+    <w:lsdException w:name="List Table 3 Accent 2" w:uiPriority="48"/>
+    <w:lsdException w:name="List Table 4 Accent 2" w:uiPriority="49"/>
+    <w:lsdException w:name="List Table 5 Dark Accent 2" w:uiPriority="50"/>
+    <w:lsdException w:name="List Table 6 Colorful Accent 2" w:uiPriority="51"/>
+    <w:lsdException w:name="List Table 7 Colorful Accent 2" w:uiPriority="52"/>
+    <w:lsdException w:name="List Table 1 Light Accent 3" w:uiPriority="46"/>
+    <w:lsdException w:name="List Table 2 Accent 3" w:uiPriority="47"/>
+    <w:lsdException w:name="List Table 3 Accent 3" w:uiPriority="48"/>
+    <w:lsdException w:name="List Table 4 Accent 3" w:uiPriority="49"/>
+    <w:lsdException w:name="List Table 5 Dark Accent 3" w:uiPriority="50"/>
+    <w:lsdException w:name="List Table 6 Colorful Accent 3" w:uiPriority="51"/>
+    <w:lsdException w:name="List Table 7 Colorful Accent 3" w:uiPriority="52"/>
+    <w:lsdException w:name="List Table 1 Light Accent 4" w:uiPriority="46"/>
+    <w:lsdException w:name="List Table 2 Accent 4" w:uiPriority="47"/>
+    <w:lsdException w:name="List Table 3 Accent 4" w:uiPriority="48"/>
+    <w:lsdException w:name="List Table 4 Accent 4" w:uiPriority="49"/>
+    <w:lsdException w:name="List Table 5 Dark Accent 4" w:uiPriority="50"/>
+    <w:lsdException w:name="List Table 6 Colorful Accent 4" w:uiPriority="51"/>
+    <w:lsdException w:name="List Table 7 Colorful Accent 4" w:uiPriority="52"/>
+    <w:lsdException w:name="List Table 1 Light Accent 5" w:uiPriority="46"/>
+    <w:lsdException w:name="List Table 2 Accent 5" w:uiPriority="47"/>
+    <w:lsdException w:name="List Table 3 Accent 5" w:uiPriority="48"/>
+    <w:lsdException w:name="List Table 4 Accent 5" w:uiPriority="49"/>
+    <w:lsdException w:name="List Table 5 Dark Accent 5" w:uiPriority="50"/>
+    <w:lsdException w:name="List Table 6 Colorful Accent 5" w:uiPriority="51"/>
+    <w:lsdException w:name="List Table 7 Colorful Accent 5" w:uiPriority="52"/>
+    <w:lsdException w:name="List Table 1 Light Accent 6" w:uiPriority="46"/>
+    <w:lsdException w:name="List Table 2 Accent 6" w:uiPriority="47"/>
+    <w:lsdException w:name="List Table 3 Accent 6" w:uiPriority="48"/>
+    <w:lsdException w:name="List Table 4 Accent 6" w:uiPriority="49"/>
+    <w:lsdException w:name="List Table 5 Dark Accent 6" w:uiPriority="50"/>
+    <w:lsdException w:name="List Table 6 Colorful Accent 6" w:uiPriority="51"/>
+    <w:lsdException w:name="List Table 7 Colorful Accent 6" w:uiPriority="52"/>
+    <w:lsdException w:name="Mention" w:semiHidden="1" w:unhideWhenUsed="1"/>
+    <w:lsdException w:name="Smart Hyperlink" w:semiHidden="1" w:unhideWhenUsed="1"/>
+    <w:lsdException w:name="Hashtag" w:semiHidden="1" w:unhideWhenUsed="1"/>
+    <w:lsdException w:name="Unresolved Mention" w:semiHidden="1" w:unhideWhenUsed="1"/>
+    <w:lsdException w:name="Smart Link" w:semiHidden="1" w:unhideWhenUsed="1"/>
+  </w:latentStyles>
+  <w:style w:type="paragraph" w:default="1" w:styleId="Normal">
+    <w:name w:val="Normal"/>
+    <w:qFormat/>
   </w:style>
   <w:style w:type="paragraph" w:styleId="Heading1">
     <w:name w:val="heading 1"/>
     <w:basedOn w:val="Normal"/>
     <w:next w:val="Normal"/>
+    <w:uiPriority w:val="9"/>
+    <w:qFormat/>
     <w:pPr>
-      <w:keepNext w:val="1"/>
-      <w:keepLines w:val="1"/>
-      <w:pageBreakBefore w:val="0"/>
-      <w:spacing w:after="120" w:before="400" w:lineRule="auto"/>
+      <w:keepNext/>
+      <w:keepLines/>
+      <w:spacing w:before="400" w:after="120"/>
+      <w:outlineLvl w:val="0"/>
     </w:pPr>
     <w:rPr>
       <w:sz w:val="40"/>
@@ -1157,15 +1236,16 @@
     <w:name w:val="heading 2"/>
     <w:basedOn w:val="Normal"/>
     <w:next w:val="Normal"/>
+    <w:uiPriority w:val="9"/>
+    <w:unhideWhenUsed/>
+    <w:qFormat/>
     <w:pPr>
-      <w:keepNext w:val="1"/>
-      <w:keepLines w:val="1"/>
-      <w:pageBreakBefore w:val="0"/>
-      <w:spacing w:after="120" w:before="360" w:lineRule="auto"/>
+      <w:keepNext/>
+      <w:keepLines/>
+      <w:spacing w:before="360" w:after="120"/>
+      <w:outlineLvl w:val="1"/>
     </w:pPr>
     <w:rPr>
-      <w:b w:val="0"/>
-      <w:bCs w:val="0"/>
       <w:sz w:val="32"/>
       <w:szCs w:val="32"/>
     </w:rPr>
@@ -1174,15 +1254,16 @@
     <w:name w:val="heading 3"/>
     <w:basedOn w:val="Normal"/>
     <w:next w:val="Normal"/>
+    <w:uiPriority w:val="9"/>
+    <w:unhideWhenUsed/>
+    <w:qFormat/>
     <w:pPr>
-      <w:keepNext w:val="1"/>
-      <w:keepLines w:val="1"/>
-      <w:pageBreakBefore w:val="0"/>
-      <w:spacing w:after="80" w:before="320" w:lineRule="auto"/>
+      <w:keepNext/>
+      <w:keepLines/>
+      <w:spacing w:before="320" w:after="80"/>
+      <w:outlineLvl w:val="2"/>
     </w:pPr>
     <w:rPr>
-      <w:b w:val="0"/>
-      <w:bCs w:val="0"/>
       <w:color w:val="434343"/>
       <w:sz w:val="28"/>
       <w:szCs w:val="28"/>
@@ -1192,11 +1273,15 @@
     <w:name w:val="heading 4"/>
     <w:basedOn w:val="Normal"/>
     <w:next w:val="Normal"/>
+    <w:uiPriority w:val="9"/>
+    <w:semiHidden/>
+    <w:unhideWhenUsed/>
+    <w:qFormat/>
     <w:pPr>
-      <w:keepNext w:val="1"/>
-      <w:keepLines w:val="1"/>
-      <w:pageBreakBefore w:val="0"/>
-      <w:spacing w:after="80" w:before="280" w:lineRule="auto"/>
+      <w:keepNext/>
+      <w:keepLines/>
+      <w:spacing w:before="280" w:after="80"/>
+      <w:outlineLvl w:val="3"/>
     </w:pPr>
     <w:rPr>
       <w:color w:val="666666"/>
@@ -1208,45 +1293,87 @@
     <w:name w:val="heading 5"/>
     <w:basedOn w:val="Normal"/>
     <w:next w:val="Normal"/>
+    <w:uiPriority w:val="9"/>
+    <w:semiHidden/>
+    <w:unhideWhenUsed/>
+    <w:qFormat/>
     <w:pPr>
-      <w:keepNext w:val="1"/>
-      <w:keepLines w:val="1"/>
-      <w:pageBreakBefore w:val="0"/>
-      <w:spacing w:after="80" w:before="240" w:lineRule="auto"/>
+      <w:keepNext/>
+      <w:keepLines/>
+      <w:spacing w:before="240" w:after="80"/>
+      <w:outlineLvl w:val="4"/>
     </w:pPr>
     <w:rPr>
       <w:color w:val="666666"/>
-      <w:sz w:val="22"/>
-      <w:szCs w:val="22"/>
     </w:rPr>
   </w:style>
   <w:style w:type="paragraph" w:styleId="Heading6">
     <w:name w:val="heading 6"/>
     <w:basedOn w:val="Normal"/>
     <w:next w:val="Normal"/>
+    <w:uiPriority w:val="9"/>
+    <w:semiHidden/>
+    <w:unhideWhenUsed/>
+    <w:qFormat/>
     <w:pPr>
-      <w:keepNext w:val="1"/>
-      <w:keepLines w:val="1"/>
-      <w:pageBreakBefore w:val="0"/>
-      <w:spacing w:after="80" w:before="240" w:lineRule="auto"/>
+      <w:keepNext/>
+      <w:keepLines/>
+      <w:spacing w:before="240" w:after="80"/>
+      <w:outlineLvl w:val="5"/>
     </w:pPr>
     <w:rPr>
-      <w:i w:val="1"/>
-      <w:iCs w:val="1"/>
+      <w:i/>
+      <w:iCs/>
       <w:color w:val="666666"/>
-      <w:sz w:val="22"/>
-      <w:szCs w:val="22"/>
     </w:rPr>
+  </w:style>
+  <w:style w:type="character" w:default="1" w:styleId="DefaultParagraphFont">
+    <w:name w:val="Default Paragraph Font"/>
+    <w:uiPriority w:val="1"/>
+    <w:unhideWhenUsed/>
+  </w:style>
+  <w:style w:type="table" w:default="1" w:styleId="TableNormal">
+    <w:name w:val="Normal Table"/>
+    <w:uiPriority w:val="99"/>
+    <w:semiHidden/>
+    <w:unhideWhenUsed/>
+    <w:tblPr>
+      <w:tblInd w:w="0" w:type="dxa"/>
+      <w:tblCellMar>
+        <w:top w:w="0" w:type="dxa"/>
+        <w:left w:w="108" w:type="dxa"/>
+        <w:bottom w:w="0" w:type="dxa"/>
+        <w:right w:w="108" w:type="dxa"/>
+      </w:tblCellMar>
+    </w:tblPr>
+  </w:style>
+  <w:style w:type="numbering" w:default="1" w:styleId="NoList">
+    <w:name w:val="No List"/>
+    <w:uiPriority w:val="99"/>
+    <w:semiHidden/>
+    <w:unhideWhenUsed/>
+  </w:style>
+  <w:style w:type="table" w:customStyle="1" w:styleId="TableNormal0">
+    <w:name w:val="TableNormal"/>
+    <w:tblPr>
+      <w:tblCellMar>
+        <w:top w:w="100" w:type="dxa"/>
+        <w:left w:w="100" w:type="dxa"/>
+        <w:bottom w:w="100" w:type="dxa"/>
+        <w:right w:w="100" w:type="dxa"/>
+      </w:tblCellMar>
+    </w:tblPr>
   </w:style>
   <w:style w:type="paragraph" w:styleId="Title">
     <w:name w:val="Title"/>
     <w:basedOn w:val="Normal"/>
     <w:next w:val="Normal"/>
+    <w:uiPriority w:val="10"/>
+    <w:qFormat/>
     <w:pPr>
-      <w:keepNext w:val="1"/>
-      <w:keepLines w:val="1"/>
-      <w:pageBreakBefore w:val="0"/>
-      <w:spacing w:after="60" w:before="0" w:lineRule="auto"/>
+      <w:keepNext/>
+      <w:keepLines/>
+      <w:spacing w:after="60"/>
     </w:pPr>
     <w:rPr>
       <w:sz w:val="52"/>
@@ -1257,16 +1384,14 @@
     <w:name w:val="Subtitle"/>
     <w:basedOn w:val="Normal"/>
     <w:next w:val="Normal"/>
+    <w:uiPriority w:val="11"/>
+    <w:qFormat/>
     <w:pPr>
-      <w:keepNext w:val="1"/>
-      <w:keepLines w:val="1"/>
-      <w:pageBreakBefore w:val="0"/>
-      <w:spacing w:after="320" w:before="0" w:lineRule="auto"/>
+      <w:keepNext/>
+      <w:keepLines/>
+      <w:spacing w:after="320"/>
     </w:pPr>
     <w:rPr>
-      <w:rFonts w:ascii="Arial" w:cs="Arial" w:eastAsia="Arial" w:hAnsi="Arial"/>
-      <w:i w:val="0"/>
-      <w:iCs w:val="0"/>
       <w:color w:val="666666"/>
       <w:sz w:val="30"/>
       <w:szCs w:val="30"/>

</xml_diff>